<commit_message>
Progress : 100 completion on testing phase
</commit_message>
<xml_diff>
--- a/AI-Image-Detector-Stimulation/OOP-Project-Report.docx
+++ b/AI-Image-Detector-Stimulation/OOP-Project-Report.docx
@@ -68,21 +68,59 @@
       </w:pPr>
       <w:r>
         <w:rPr>
+          <w:sz w:val="36"/>
+          <w:szCs w:val="36"/>
+        </w:rPr>
+        <w:t>Object Oriented Programing</w:t>
+      </w:r>
+      <w:r>
+        <w:rPr>
+          <w:sz w:val="36"/>
+          <w:szCs w:val="36"/>
+        </w:rPr>
+        <w:t>(</w:t>
+      </w:r>
+      <w:r>
+        <w:rPr>
+          <w:sz w:val="36"/>
+          <w:szCs w:val="36"/>
+        </w:rPr>
+        <w:t>OOP</w:t>
+      </w:r>
+      <w:r>
+        <w:rPr>
+          <w:sz w:val="36"/>
+          <w:szCs w:val="36"/>
+        </w:rPr>
+        <w:t>)</w:t>
+      </w:r>
+    </w:p>
+    <w:p>
+      <w:pPr>
+        <w:spacing w:after="120"/>
+        <w:jc w:val="center"/>
+        <w:rPr>
+          <w:sz w:val="42"/>
+          <w:szCs w:val="42"/>
+        </w:rPr>
+      </w:pPr>
+      <w:r>
+        <w:rPr>
           <w:noProof/>
           <w:sz w:val="36"/>
           <w:szCs w:val="36"/>
         </w:rPr>
         <w:drawing>
-          <wp:anchor distT="0" distB="0" distL="114300" distR="114300" simplePos="0" relativeHeight="251658240" behindDoc="0" locked="0" layoutInCell="1" allowOverlap="1" wp14:anchorId="347A38D5" wp14:editId="3F664177">
+          <wp:anchor distT="0" distB="0" distL="114300" distR="114300" simplePos="0" relativeHeight="251658240" behindDoc="0" locked="0" layoutInCell="1" allowOverlap="1" wp14:anchorId="347A38D5" wp14:editId="7A5542DA">
             <wp:simplePos x="0" y="0"/>
             <wp:positionH relativeFrom="margin">
-              <wp:posOffset>1839595</wp:posOffset>
+              <wp:posOffset>2254250</wp:posOffset>
             </wp:positionH>
             <wp:positionV relativeFrom="paragraph">
-              <wp:posOffset>724535</wp:posOffset>
+              <wp:posOffset>462280</wp:posOffset>
             </wp:positionV>
-            <wp:extent cx="1933333" cy="1961905"/>
-            <wp:effectExtent l="0" t="0" r="0" b="635"/>
+            <wp:extent cx="1911350" cy="1960880"/>
+            <wp:effectExtent l="0" t="0" r="0" b="1270"/>
             <wp:wrapTopAndBottom/>
             <wp:docPr id="145316588" name="Picture 1"/>
             <wp:cNvGraphicFramePr>
@@ -110,7 +148,7 @@
                   <pic:spPr>
                     <a:xfrm>
                       <a:off x="0" y="0"/>
-                      <a:ext cx="1933333" cy="1961905"/>
+                      <a:ext cx="1911350" cy="1960880"/>
                     </a:xfrm>
                     <a:prstGeom prst="rect">
                       <a:avLst/>
@@ -119,37 +157,12 @@
                 </pic:pic>
               </a:graphicData>
             </a:graphic>
+            <wp14:sizeRelH relativeFrom="margin">
+              <wp14:pctWidth>0</wp14:pctWidth>
+            </wp14:sizeRelH>
           </wp:anchor>
         </w:drawing>
       </w:r>
-      <w:r>
-        <w:rPr>
-          <w:sz w:val="36"/>
-          <w:szCs w:val="36"/>
-        </w:rPr>
-        <w:t>Object Oriented Programing</w:t>
-      </w:r>
-      <w:r>
-        <w:rPr>
-          <w:sz w:val="36"/>
-          <w:szCs w:val="36"/>
-        </w:rPr>
-        <w:t>(</w:t>
-      </w:r>
-      <w:r>
-        <w:rPr>
-          <w:sz w:val="36"/>
-          <w:szCs w:val="36"/>
-        </w:rPr>
-        <w:t>OOP</w:t>
-      </w:r>
-      <w:r>
-        <w:rPr>
-          <w:sz w:val="36"/>
-          <w:szCs w:val="36"/>
-        </w:rPr>
-        <w:t>)</w:t>
-      </w:r>
     </w:p>
     <w:p>
       <w:pPr>
@@ -165,23 +178,13 @@
       <w:pPr>
         <w:spacing w:after="120"/>
         <w:jc w:val="center"/>
+      </w:pPr>
+      <w:r>
         <w:rPr>
           <w:sz w:val="42"/>
           <w:szCs w:val="42"/>
         </w:rPr>
-      </w:pPr>
-    </w:p>
-    <w:p>
-      <w:pPr>
-        <w:spacing w:after="120"/>
-        <w:jc w:val="center"/>
-      </w:pPr>
-      <w:r>
-        <w:rPr>
-          <w:sz w:val="42"/>
-          <w:szCs w:val="42"/>
-        </w:rPr>
-        <w:t>Submitted by</w:t>
+        <w:t>Member</w:t>
       </w:r>
     </w:p>
     <w:p>
@@ -3905,23 +3908,7 @@
           <w:sz w:val="24"/>
           <w:szCs w:val="24"/>
         </w:rPr>
-        <w:t xml:space="preserve">It also </w:t>
-      </w:r>
-      <w:proofErr w:type="gramStart"/>
-      <w:r>
-        <w:rPr>
-          <w:sz w:val="24"/>
-          <w:szCs w:val="24"/>
-        </w:rPr>
-        <w:t>give</w:t>
-      </w:r>
-      <w:proofErr w:type="gramEnd"/>
-      <w:r>
-        <w:rPr>
-          <w:sz w:val="24"/>
-          <w:szCs w:val="24"/>
-        </w:rPr>
-        <w:t xml:space="preserve"> msg via override of iloggable class</w:t>
+        <w:t>It also give msg via override of iloggable class</w:t>
       </w:r>
     </w:p>
     <w:p>
@@ -5743,23 +5730,7 @@
           <w:sz w:val="24"/>
           <w:szCs w:val="24"/>
         </w:rPr>
-        <w:t xml:space="preserve"> multiple </w:t>
-      </w:r>
-      <w:proofErr w:type="gramStart"/>
-      <w:r>
-        <w:rPr>
-          <w:sz w:val="24"/>
-          <w:szCs w:val="24"/>
-        </w:rPr>
-        <w:t>analyzer</w:t>
-      </w:r>
-      <w:proofErr w:type="gramEnd"/>
-      <w:r>
-        <w:rPr>
-          <w:sz w:val="24"/>
-          <w:szCs w:val="24"/>
-        </w:rPr>
-        <w:t xml:space="preserve"> to generate its likable score</w:t>
+        <w:t xml:space="preserve"> multiple analyzer to generate its likable score</w:t>
       </w:r>
       <w:r>
         <w:rPr>

</xml_diff>